<commit_message>
atualizações no texto da home e musicas
</commit_message>
<xml_diff>
--- a/src/assets/images/convite-envelope.docx
+++ b/src/assets/images/convite-envelope.docx
@@ -14,10 +14,10 @@
           <wp:anchor distT="0" distB="0" distL="0" distR="0" simplePos="0" relativeHeight="2" behindDoc="0" locked="0" layoutInCell="1" allowOverlap="1">
             <wp:simplePos x="0" y="0"/>
             <wp:positionH relativeFrom="column">
-              <wp:posOffset>-568960</wp:posOffset>
+              <wp:posOffset>-384810</wp:posOffset>
             </wp:positionH>
             <wp:positionV relativeFrom="paragraph">
-              <wp:posOffset>-206375</wp:posOffset>
+              <wp:posOffset>-49530</wp:posOffset>
             </wp:positionV>
             <wp:extent cx="7225030" cy="4695190"/>
             <wp:effectExtent l="0" t="0" r="0" b="0"/>
@@ -59,16 +59,16 @@
         <mc:AlternateContent>
           <mc:Choice Requires="wps">
             <w:drawing>
-              <wp:anchor distT="32385" distB="33020" distL="24130" distR="23495" simplePos="0" relativeHeight="3" behindDoc="0" locked="0" layoutInCell="1" allowOverlap="1">
+              <wp:anchor distT="33655" distB="34290" distL="23495" distR="24130" simplePos="0" relativeHeight="3" behindDoc="0" locked="0" layoutInCell="1" allowOverlap="1">
                 <wp:simplePos x="0" y="0"/>
                 <wp:positionH relativeFrom="column">
-                  <wp:posOffset>190500</wp:posOffset>
+                  <wp:posOffset>243205</wp:posOffset>
                 </wp:positionH>
                 <wp:positionV relativeFrom="paragraph">
-                  <wp:posOffset>66675</wp:posOffset>
+                  <wp:posOffset>219075</wp:posOffset>
                 </wp:positionV>
                 <wp:extent cx="5758815" cy="4109085"/>
-                <wp:effectExtent l="23495" t="33655" r="24130" b="34290"/>
+                <wp:effectExtent l="77470" t="109220" r="76835" b="109220"/>
                 <wp:wrapNone/>
                 <wp:docPr id="2" name="Forma 1"/>
                 <a:graphic xmlns:a="http://schemas.openxmlformats.org/drawingml/2006/main">
@@ -76,7 +76,7 @@
                     <wps:wsp>
                       <wps:cNvSpPr/>
                       <wps:spPr>
-                        <a:xfrm rot="10759800">
+                        <a:xfrm rot="10932000">
                           <a:off x="0" y="0"/>
                           <a:ext cx="5758920" cy="4109040"/>
                         </a:xfrm>
@@ -105,7 +105,7 @@
           </mc:Choice>
           <mc:Fallback>
             <w:pict>
-              <v:rect id="shape_0" fillcolor="white" stroked="f" o:allowincell="f" style="position:absolute;margin-left:14.95pt;margin-top:5.2pt;width:453.4pt;height:323.5pt;mso-wrap-style:none;v-text-anchor:middle;rotation:179">
+              <v:rect id="shape_0" fillcolor="white" stroked="f" o:allowincell="f" style="position:absolute;margin-left:19.15pt;margin-top:17.25pt;width:453.4pt;height:323.5pt;mso-wrap-style:none;v-text-anchor:middle;rotation:182">
                 <v:fill o:detectmouseclick="t" type="solid" color2="black"/>
                 <v:stroke color="#3465a4" joinstyle="round" endcap="flat"/>
                 <w10:wrap type="none"/>
@@ -119,10 +119,10 @@
               <wp:anchor distT="26035" distB="25400" distL="17145" distR="17780" simplePos="0" relativeHeight="4" behindDoc="0" locked="0" layoutInCell="1" allowOverlap="1">
                 <wp:simplePos x="0" y="0"/>
                 <wp:positionH relativeFrom="column">
-                  <wp:posOffset>-69215</wp:posOffset>
+                  <wp:posOffset>-68580</wp:posOffset>
                 </wp:positionH>
                 <wp:positionV relativeFrom="paragraph">
-                  <wp:posOffset>160020</wp:posOffset>
+                  <wp:posOffset>160655</wp:posOffset>
                 </wp:positionV>
                 <wp:extent cx="6444615" cy="4302125"/>
                 <wp:effectExtent l="17145" t="26035" r="17780" b="25400"/>
@@ -155,314 +155,265 @@
                         <w:txbxContent>
                           <w:p>
                             <w:pPr>
-                              <w:pStyle w:val="Contedodoquadro"/>
-                              <w:overflowPunct w:val="true"/>
+                              <w:pStyle w:val="Contedodoquadrouser"/>
+                              <w:overflowPunct w:val="false"/>
                               <w:bidi w:val="0"/>
-                              <w:spacing w:before="238" w:after="198"/>
+                              <w:spacing w:lineRule="auto" w:line="240" w:before="238" w:after="198"/>
                               <w:jc w:val="center"/>
                               <w:rPr>
-                                <w:sz w:val="28"/>
-                                <w:szCs w:val="28"/>
+                                <w:color w:val="000000"/>
+                                <w:sz w:val="32"/>
+                                <w:szCs w:val="32"/>
                               </w:rPr>
                             </w:pPr>
                             <w:r>
                               <w:rPr>
                                 <w:b/>
                                 <w:bCs/>
-                                <w:sz w:val="28"/>
-                                <w:szCs w:val="28"/>
+                                <w:color w:val="000000"/>
+                                <w:sz w:val="32"/>
+                                <w:szCs w:val="32"/>
                               </w:rPr>
                               <w:t>CONVITE:</w:t>
                             </w:r>
                           </w:p>
                           <w:p>
                             <w:pPr>
-                              <w:pStyle w:val="Contedodoquadro"/>
-                              <w:overflowPunct w:val="true"/>
+                              <w:pStyle w:val="Contedodoquadrouser"/>
+                              <w:overflowPunct w:val="false"/>
                               <w:bidi w:val="0"/>
-                              <w:spacing w:before="238" w:after="198"/>
+                              <w:spacing w:lineRule="auto" w:line="240" w:before="238" w:after="198"/>
                               <w:jc w:val="center"/>
                               <w:rPr>
-                                <w:sz w:val="16"/>
-                                <w:szCs w:val="16"/>
+                                <w:color w:val="000000"/>
+                                <w:sz w:val="24"/>
+                                <w:szCs w:val="24"/>
                               </w:rPr>
                             </w:pPr>
                             <w:r>
                               <w:rPr>
                                 <w:b/>
                                 <w:bCs/>
-                                <w:sz w:val="16"/>
-                                <w:szCs w:val="16"/>
+                                <w:color w:val="000000"/>
+                                <w:sz w:val="24"/>
+                                <w:szCs w:val="24"/>
                               </w:rPr>
                               <w:t>À RAINHA DO LAR E FAMÍLIA COM CARINHO.</w:t>
                             </w:r>
                           </w:p>
                           <w:p>
                             <w:pPr>
-                              <w:pStyle w:val="Contedodoquadro"/>
-                              <w:overflowPunct w:val="true"/>
+                              <w:pStyle w:val="Contedodoquadrouser"/>
+                              <w:overflowPunct w:val="false"/>
                               <w:bidi w:val="0"/>
-                              <w:spacing w:before="238" w:after="198"/>
+                              <w:spacing w:lineRule="auto" w:line="240" w:before="238" w:after="198"/>
+                              <w:rPr>
+                                <w:color w:val="000000"/>
+                                <w:sz w:val="24"/>
+                                <w:szCs w:val="24"/>
+                              </w:rPr>
+                            </w:pPr>
+                            <w:r>
                               <w:rPr>
                                 <w:b/>
                                 <w:bCs/>
-                                <w:sz w:val="18"/>
-                                <w:szCs w:val="18"/>
-                              </w:rPr>
-                            </w:pPr>
-                            <w:r>
-                              <w:rPr>
-                                <w:b/>
-                                <w:bCs/>
-                                <w:sz w:val="18"/>
-                                <w:szCs w:val="18"/>
+                                <w:color w:val="000000"/>
+                                <w:sz w:val="24"/>
+                                <w:szCs w:val="24"/>
                               </w:rPr>
                               <w:t>A IGREJA:</w:t>
-                            </w:r>
-                            <w:r>
-                              <w:rPr>
-                                <w:b/>
-                                <w:bCs/>
-                                <w:sz w:val="18"/>
-                                <w:szCs w:val="18"/>
-                              </w:rPr>
-                              <w:t>__________________________________________________________________________________________________</w:t>
                             </w:r>
                           </w:p>
                           <w:p>
                             <w:pPr>
-                              <w:pStyle w:val="Contedodoquadro"/>
-                              <w:overflowPunct w:val="true"/>
+                              <w:pStyle w:val="Contedodoquadrouser"/>
+                              <w:overflowPunct w:val="false"/>
                               <w:bidi w:val="0"/>
-                              <w:spacing w:before="238" w:after="198"/>
+                              <w:spacing w:lineRule="auto" w:line="240" w:before="238" w:after="198"/>
                               <w:jc w:val="left"/>
                               <w:rPr>
-                                <w:sz w:val="4"/>
-                                <w:szCs w:val="4"/>
+                                <w:sz w:val="24"/>
+                                <w:szCs w:val="24"/>
                               </w:rPr>
                             </w:pPr>
                             <w:r>
                               <w:rPr>
-                                <w:sz w:val="16"/>
-                                <w:szCs w:val="16"/>
-                              </w:rPr>
-                              <w:t>ENDEREÇO</w:t>
-                            </w:r>
-                            <w:r>
-                              <w:rPr>
-                                <w:sz w:val="4"/>
-                                <w:szCs w:val="4"/>
-                              </w:rPr>
-                              <w:t>:__________________________________________________________________________________________________________________________________________________________________________</w:t>
-                            </w:r>
-                            <w:r>
-                              <w:rPr>
-                                <w:sz w:val="4"/>
-                                <w:szCs w:val="4"/>
-                              </w:rPr>
-                              <w:t>________________________________________________________________________________________________________________________________________________________________________________________________________________________________________________________________________</w:t>
-                            </w:r>
-                            <w:r>
-                              <w:rPr>
-                                <w:sz w:val="4"/>
-                                <w:szCs w:val="4"/>
-                              </w:rPr>
-                              <w:t>___________</w:t>
+                                <w:color w:val="000000"/>
+                                <w:sz w:val="24"/>
+                                <w:szCs w:val="24"/>
+                              </w:rPr>
+                              <w:t>ENDEREÇO:</w:t>
                             </w:r>
                           </w:p>
                           <w:p>
                             <w:pPr>
-                              <w:pStyle w:val="Contedodoquadro"/>
-                              <w:overflowPunct w:val="true"/>
+                              <w:pStyle w:val="Contedodoquadrouser"/>
+                              <w:overflowPunct w:val="false"/>
                               <w:bidi w:val="0"/>
-                              <w:spacing w:before="238" w:after="198"/>
+                              <w:spacing w:lineRule="auto" w:line="240" w:before="238" w:after="198"/>
                               <w:jc w:val="left"/>
                               <w:rPr>
-                                <w:sz w:val="16"/>
-                                <w:szCs w:val="16"/>
+                                <w:color w:val="000000"/>
+                                <w:sz w:val="24"/>
+                                <w:szCs w:val="24"/>
                               </w:rPr>
                             </w:pPr>
                             <w:r>
                               <w:rPr>
-                                <w:sz w:val="16"/>
-                                <w:szCs w:val="16"/>
-                              </w:rPr>
-                              <w:t>PONTO DE REFERENCIA:__________________________________________________________________</w:t>
-                            </w:r>
-                            <w:r>
-                              <w:rPr>
-                                <w:sz w:val="16"/>
-                                <w:szCs w:val="16"/>
-                              </w:rPr>
-                              <w:t>_________________________________</w:t>
+                                <w:color w:val="000000"/>
+                                <w:sz w:val="24"/>
+                                <w:szCs w:val="24"/>
+                              </w:rPr>
+                              <w:t>PONTO DE REFERENCIA:</w:t>
                             </w:r>
                           </w:p>
                           <w:p>
                             <w:pPr>
-                              <w:pStyle w:val="Contedodoquadro"/>
-                              <w:overflowPunct w:val="true"/>
+                              <w:pStyle w:val="Contedodoquadrouser"/>
+                              <w:overflowPunct w:val="false"/>
                               <w:bidi w:val="0"/>
-                              <w:spacing w:before="238" w:after="198"/>
+                              <w:spacing w:lineRule="auto" w:line="240" w:before="238" w:after="198"/>
                               <w:jc w:val="left"/>
                               <w:rPr>
-                                <w:sz w:val="4"/>
-                                <w:szCs w:val="4"/>
+                                <w:color w:val="000000"/>
+                                <w:sz w:val="24"/>
+                                <w:szCs w:val="24"/>
                               </w:rPr>
                             </w:pPr>
                             <w:r>
                               <w:rPr>
-                                <w:sz w:val="16"/>
-                                <w:szCs w:val="16"/>
-                              </w:rPr>
-                              <w:t>ÔNIBUS</w:t>
-                            </w:r>
-                            <w:r>
-                              <w:rPr>
-                                <w:sz w:val="4"/>
-                                <w:szCs w:val="4"/>
-                              </w:rPr>
-                              <w:t>:</w:t>
-                            </w:r>
-                            <w:r>
-                              <w:rPr>
-                                <w:sz w:val="16"/>
-                                <w:szCs w:val="16"/>
-                              </w:rPr>
-                              <w:t>___________________________________________________________________________________</w:t>
-                            </w:r>
-                            <w:r>
-                              <w:rPr>
-                                <w:sz w:val="16"/>
-                                <w:szCs w:val="16"/>
-                              </w:rPr>
-                              <w:t>___________________________</w:t>
-                            </w:r>
-                            <w:r>
-                              <w:rPr>
-                                <w:sz w:val="16"/>
-                                <w:szCs w:val="16"/>
-                              </w:rPr>
-                              <w:t>_____</w:t>
+                                <w:color w:val="000000"/>
+                                <w:sz w:val="24"/>
+                                <w:szCs w:val="24"/>
+                              </w:rPr>
+                              <w:t xml:space="preserve">ÔNIBUS: </w:t>
                             </w:r>
                           </w:p>
                           <w:p>
                             <w:pPr>
-                              <w:pStyle w:val="Contedodoquadro"/>
-                              <w:overflowPunct w:val="true"/>
+                              <w:pStyle w:val="Contedodoquadrouser"/>
+                              <w:overflowPunct w:val="false"/>
                               <w:bidi w:val="0"/>
-                              <w:spacing w:before="238" w:after="198"/>
+                              <w:spacing w:lineRule="auto" w:line="240" w:before="238" w:after="198"/>
                               <w:jc w:val="left"/>
                               <w:rPr>
-                                <w:sz w:val="4"/>
-                                <w:szCs w:val="4"/>
+                                <w:sz w:val="24"/>
+                                <w:szCs w:val="24"/>
                               </w:rPr>
                             </w:pPr>
                             <w:r>
                               <w:rPr>
-                                <w:sz w:val="16"/>
-                                <w:szCs w:val="16"/>
-                              </w:rPr>
-                              <w:t>SALTAR</w:t>
-                            </w:r>
-                            <w:r>
-                              <w:rPr>
-                                <w:sz w:val="4"/>
-                                <w:szCs w:val="4"/>
-                              </w:rPr>
-                              <w:t>:________________________________________________________________________________________</w:t>
-                            </w:r>
-                            <w:r>
-                              <w:rPr>
-                                <w:sz w:val="4"/>
-                                <w:szCs w:val="4"/>
-                              </w:rPr>
-                              <w:softHyphen/>
-                              <w:t>___________________________________________________________________________________________________________________________________________________________________________________________________________________________________________________________________________________________________________________________________________________________________________________</w:t>
+                                <w:color w:val="000000"/>
+                                <w:sz w:val="24"/>
+                                <w:szCs w:val="24"/>
+                              </w:rPr>
+                              <w:t>SALTAR:</w:t>
                             </w:r>
                           </w:p>
                           <w:p>
                             <w:pPr>
-                              <w:pStyle w:val="Contedodoquadro"/>
-                              <w:overflowPunct w:val="true"/>
+                              <w:pStyle w:val="Contedodoquadrouser"/>
+                              <w:overflowPunct w:val="false"/>
                               <w:bidi w:val="0"/>
-                              <w:spacing w:before="238" w:after="198"/>
+                              <w:spacing w:lineRule="auto" w:line="240" w:before="238" w:after="198"/>
                               <w:jc w:val="left"/>
                               <w:rPr>
-                                <w:sz w:val="16"/>
-                                <w:szCs w:val="16"/>
+                                <w:color w:val="000000"/>
+                                <w:sz w:val="24"/>
+                                <w:szCs w:val="24"/>
                               </w:rPr>
                             </w:pPr>
+                            <w:hyperlink r:id="rId3">
+                              <w:r>
+                                <w:rPr>
+                                  <w:rStyle w:val="Hyperlink"/>
+                                  <w:color w:val="000000"/>
+                                  <w:sz w:val="24"/>
+                                  <w:szCs w:val="24"/>
+                                  <w:u w:val="none"/>
+                                </w:rPr>
+                                <w:t>DATA:                                   ÀS</w:t>
+                              </w:r>
+                            </w:hyperlink>
                             <w:r>
                               <w:rPr>
-                                <w:sz w:val="16"/>
-                                <w:szCs w:val="16"/>
-                              </w:rPr>
-                              <w:t>DATA:________________________ ÀS__________ HORAS.</w:t>
+                                <w:color w:val="000000"/>
+                                <w:sz w:val="24"/>
+                                <w:szCs w:val="24"/>
+                              </w:rPr>
+                              <w:t xml:space="preserve">                         HORAS.</w:t>
                             </w:r>
                           </w:p>
                           <w:p>
                             <w:pPr>
-                              <w:pStyle w:val="Contedodoquadro"/>
-                              <w:overflowPunct w:val="true"/>
+                              <w:pStyle w:val="Contedodoquadrouser"/>
+                              <w:overflowPunct w:val="false"/>
                               <w:bidi w:val="0"/>
-                              <w:spacing w:before="238" w:after="198"/>
+                              <w:spacing w:lineRule="auto" w:line="240" w:before="238" w:after="198"/>
                               <w:jc w:val="left"/>
                               <w:rPr>
-                                <w:sz w:val="16"/>
-                                <w:szCs w:val="16"/>
+                                <w:color w:val="000000"/>
+                                <w:sz w:val="24"/>
+                                <w:szCs w:val="24"/>
                               </w:rPr>
                             </w:pPr>
                             <w:r>
                               <w:rPr>
-                                <w:sz w:val="16"/>
-                                <w:szCs w:val="16"/>
-                              </w:rPr>
-                              <w:t xml:space="preserve">CONFIRME A PRESENÇA E O Nº DE FAMILIARES A COMPARECER </w:t>
+                                <w:color w:val="000000"/>
+                                <w:sz w:val="24"/>
+                                <w:szCs w:val="24"/>
+                              </w:rPr>
+                              <w:t xml:space="preserve">CONFIRME A PRESENÇA E O Nº DE FAMILIARES A COMPARECER ATRAVÉS DO </w:t>
                             </w:r>
                             <w:r>
                               <w:rPr>
-                                <w:sz w:val="16"/>
-                                <w:szCs w:val="16"/>
-                              </w:rPr>
-                              <w:t xml:space="preserve">ATRAVÉS DO </w:t>
+                                <w:color w:val="000000"/>
+                                <w:sz w:val="24"/>
+                                <w:szCs w:val="24"/>
+                              </w:rPr>
+                              <w:t>WhatsApp</w:t>
                             </w:r>
                           </w:p>
                           <w:p>
                             <w:pPr>
-                              <w:pStyle w:val="Contedodoquadro"/>
-                              <w:overflowPunct w:val="true"/>
+                              <w:pStyle w:val="Contedodoquadrouser"/>
+                              <w:overflowPunct w:val="false"/>
                               <w:bidi w:val="0"/>
-                              <w:spacing w:before="238" w:after="198"/>
+                              <w:spacing w:lineRule="auto" w:line="240" w:before="238" w:after="198"/>
                               <w:jc w:val="left"/>
                               <w:rPr>
-                                <w:sz w:val="16"/>
-                                <w:szCs w:val="16"/>
+                                <w:color w:val="000000"/>
+                                <w:sz w:val="24"/>
+                                <w:szCs w:val="24"/>
                               </w:rPr>
                             </w:pPr>
                             <w:r>
                               <w:rPr>
-                                <w:sz w:val="16"/>
-                                <w:szCs w:val="16"/>
+                                <w:color w:val="000000"/>
+                                <w:sz w:val="24"/>
+                                <w:szCs w:val="24"/>
                               </w:rPr>
                               <w:t>WHATSAPP:______________________________________________________________________</w:t>
                             </w:r>
                           </w:p>
                           <w:p>
                             <w:pPr>
-                              <w:pStyle w:val="Contedodoquadro"/>
-                              <w:overflowPunct w:val="true"/>
+                              <w:pStyle w:val="Contedodoquadrouser"/>
+                              <w:overflowPunct w:val="false"/>
                               <w:bidi w:val="0"/>
                               <w:spacing w:before="238" w:after="198"/>
                               <w:jc w:val="left"/>
                               <w:rPr>
-                                <w:sz w:val="16"/>
-                                <w:szCs w:val="16"/>
+                                <w:color w:val="000000"/>
+                                <w:sz w:val="24"/>
+                                <w:szCs w:val="24"/>
                               </w:rPr>
                             </w:pPr>
                             <w:r>
                               <w:rPr>
-                                <w:sz w:val="16"/>
-                                <w:szCs w:val="16"/>
+                                <w:color w:val="000000"/>
+                                <w:sz w:val="24"/>
+                                <w:szCs w:val="24"/>
                               </w:rPr>
                             </w:r>
                           </w:p>
@@ -479,321 +430,272 @@
           </mc:Choice>
           <mc:Fallback>
             <w:pict>
-              <v:rect id="shape_0" stroked="f" o:allowincell="f" style="position:absolute;margin-left:-5.5pt;margin-top:12.55pt;width:507.4pt;height:338.7pt;mso-wrap-style:square;v-text-anchor:top;rotation:359">
+              <v:rect id="shape_0" stroked="f" o:allowincell="f" style="position:absolute;margin-left:-5.45pt;margin-top:12.6pt;width:507.4pt;height:338.7pt;mso-wrap-style:square;v-text-anchor:top;rotation:359">
                 <v:fill o:detectmouseclick="t" on="false"/>
                 <v:stroke color="#3465a4" joinstyle="round" endcap="flat"/>
                 <v:textbox>
                   <w:txbxContent>
                     <w:p>
                       <w:pPr>
-                        <w:pStyle w:val="Contedodoquadro"/>
-                        <w:overflowPunct w:val="true"/>
+                        <w:pStyle w:val="Contedodoquadrouser"/>
+                        <w:overflowPunct w:val="false"/>
                         <w:bidi w:val="0"/>
-                        <w:spacing w:before="238" w:after="198"/>
+                        <w:spacing w:lineRule="auto" w:line="240" w:before="238" w:after="198"/>
                         <w:jc w:val="center"/>
                         <w:rPr>
-                          <w:sz w:val="28"/>
-                          <w:szCs w:val="28"/>
+                          <w:color w:val="000000"/>
+                          <w:sz w:val="32"/>
+                          <w:szCs w:val="32"/>
                         </w:rPr>
                       </w:pPr>
                       <w:r>
                         <w:rPr>
                           <w:b/>
                           <w:bCs/>
-                          <w:sz w:val="28"/>
-                          <w:szCs w:val="28"/>
+                          <w:color w:val="000000"/>
+                          <w:sz w:val="32"/>
+                          <w:szCs w:val="32"/>
                         </w:rPr>
                         <w:t>CONVITE:</w:t>
                       </w:r>
                     </w:p>
                     <w:p>
                       <w:pPr>
-                        <w:pStyle w:val="Contedodoquadro"/>
-                        <w:overflowPunct w:val="true"/>
+                        <w:pStyle w:val="Contedodoquadrouser"/>
+                        <w:overflowPunct w:val="false"/>
                         <w:bidi w:val="0"/>
-                        <w:spacing w:before="238" w:after="198"/>
+                        <w:spacing w:lineRule="auto" w:line="240" w:before="238" w:after="198"/>
                         <w:jc w:val="center"/>
                         <w:rPr>
-                          <w:sz w:val="16"/>
-                          <w:szCs w:val="16"/>
+                          <w:color w:val="000000"/>
+                          <w:sz w:val="24"/>
+                          <w:szCs w:val="24"/>
                         </w:rPr>
                       </w:pPr>
                       <w:r>
                         <w:rPr>
                           <w:b/>
                           <w:bCs/>
-                          <w:sz w:val="16"/>
-                          <w:szCs w:val="16"/>
+                          <w:color w:val="000000"/>
+                          <w:sz w:val="24"/>
+                          <w:szCs w:val="24"/>
                         </w:rPr>
                         <w:t>À RAINHA DO LAR E FAMÍLIA COM CARINHO.</w:t>
                       </w:r>
                     </w:p>
                     <w:p>
                       <w:pPr>
-                        <w:pStyle w:val="Contedodoquadro"/>
-                        <w:overflowPunct w:val="true"/>
+                        <w:pStyle w:val="Contedodoquadrouser"/>
+                        <w:overflowPunct w:val="false"/>
                         <w:bidi w:val="0"/>
-                        <w:spacing w:before="238" w:after="198"/>
+                        <w:spacing w:lineRule="auto" w:line="240" w:before="238" w:after="198"/>
+                        <w:rPr>
+                          <w:color w:val="000000"/>
+                          <w:sz w:val="24"/>
+                          <w:szCs w:val="24"/>
+                        </w:rPr>
+                      </w:pPr>
+                      <w:r>
                         <w:rPr>
                           <w:b/>
                           <w:bCs/>
-                          <w:sz w:val="18"/>
-                          <w:szCs w:val="18"/>
-                        </w:rPr>
-                      </w:pPr>
-                      <w:r>
-                        <w:rPr>
-                          <w:b/>
-                          <w:bCs/>
-                          <w:sz w:val="18"/>
-                          <w:szCs w:val="18"/>
+                          <w:color w:val="000000"/>
+                          <w:sz w:val="24"/>
+                          <w:szCs w:val="24"/>
                         </w:rPr>
                         <w:t>A IGREJA:</w:t>
-                      </w:r>
-                      <w:r>
-                        <w:rPr>
-                          <w:b/>
-                          <w:bCs/>
-                          <w:sz w:val="18"/>
-                          <w:szCs w:val="18"/>
-                        </w:rPr>
-                        <w:t>__________________________________________________________________________________________________</w:t>
                       </w:r>
                     </w:p>
                     <w:p>
                       <w:pPr>
-                        <w:pStyle w:val="Contedodoquadro"/>
-                        <w:overflowPunct w:val="true"/>
+                        <w:pStyle w:val="Contedodoquadrouser"/>
+                        <w:overflowPunct w:val="false"/>
                         <w:bidi w:val="0"/>
-                        <w:spacing w:before="238" w:after="198"/>
+                        <w:spacing w:lineRule="auto" w:line="240" w:before="238" w:after="198"/>
                         <w:jc w:val="left"/>
                         <w:rPr>
-                          <w:sz w:val="4"/>
-                          <w:szCs w:val="4"/>
+                          <w:sz w:val="24"/>
+                          <w:szCs w:val="24"/>
                         </w:rPr>
                       </w:pPr>
                       <w:r>
                         <w:rPr>
-                          <w:sz w:val="16"/>
-                          <w:szCs w:val="16"/>
-                        </w:rPr>
-                        <w:t>ENDEREÇO</w:t>
-                      </w:r>
-                      <w:r>
-                        <w:rPr>
-                          <w:sz w:val="4"/>
-                          <w:szCs w:val="4"/>
-                        </w:rPr>
-                        <w:t>:__________________________________________________________________________________________________________________________________________________________________________</w:t>
-                      </w:r>
-                      <w:r>
-                        <w:rPr>
-                          <w:sz w:val="4"/>
-                          <w:szCs w:val="4"/>
-                        </w:rPr>
-                        <w:t>________________________________________________________________________________________________________________________________________________________________________________________________________________________________________________________________________</w:t>
-                      </w:r>
-                      <w:r>
-                        <w:rPr>
-                          <w:sz w:val="4"/>
-                          <w:szCs w:val="4"/>
-                        </w:rPr>
-                        <w:t>___________</w:t>
+                          <w:color w:val="000000"/>
+                          <w:sz w:val="24"/>
+                          <w:szCs w:val="24"/>
+                        </w:rPr>
+                        <w:t>ENDEREÇO:</w:t>
                       </w:r>
                     </w:p>
                     <w:p>
                       <w:pPr>
-                        <w:pStyle w:val="Contedodoquadro"/>
-                        <w:overflowPunct w:val="true"/>
+                        <w:pStyle w:val="Contedodoquadrouser"/>
+                        <w:overflowPunct w:val="false"/>
                         <w:bidi w:val="0"/>
-                        <w:spacing w:before="238" w:after="198"/>
+                        <w:spacing w:lineRule="auto" w:line="240" w:before="238" w:after="198"/>
                         <w:jc w:val="left"/>
                         <w:rPr>
-                          <w:sz w:val="16"/>
-                          <w:szCs w:val="16"/>
+                          <w:color w:val="000000"/>
+                          <w:sz w:val="24"/>
+                          <w:szCs w:val="24"/>
                         </w:rPr>
                       </w:pPr>
                       <w:r>
                         <w:rPr>
-                          <w:sz w:val="16"/>
-                          <w:szCs w:val="16"/>
-                        </w:rPr>
-                        <w:t>PONTO DE REFERENCIA:__________________________________________________________________</w:t>
-                      </w:r>
-                      <w:r>
-                        <w:rPr>
-                          <w:sz w:val="16"/>
-                          <w:szCs w:val="16"/>
-                        </w:rPr>
-                        <w:t>_________________________________</w:t>
+                          <w:color w:val="000000"/>
+                          <w:sz w:val="24"/>
+                          <w:szCs w:val="24"/>
+                        </w:rPr>
+                        <w:t>PONTO DE REFERENCIA:</w:t>
                       </w:r>
                     </w:p>
                     <w:p>
                       <w:pPr>
-                        <w:pStyle w:val="Contedodoquadro"/>
-                        <w:overflowPunct w:val="true"/>
+                        <w:pStyle w:val="Contedodoquadrouser"/>
+                        <w:overflowPunct w:val="false"/>
                         <w:bidi w:val="0"/>
-                        <w:spacing w:before="238" w:after="198"/>
+                        <w:spacing w:lineRule="auto" w:line="240" w:before="238" w:after="198"/>
                         <w:jc w:val="left"/>
                         <w:rPr>
-                          <w:sz w:val="4"/>
-                          <w:szCs w:val="4"/>
+                          <w:color w:val="000000"/>
+                          <w:sz w:val="24"/>
+                          <w:szCs w:val="24"/>
                         </w:rPr>
                       </w:pPr>
                       <w:r>
                         <w:rPr>
-                          <w:sz w:val="16"/>
-                          <w:szCs w:val="16"/>
-                        </w:rPr>
-                        <w:t>ÔNIBUS</w:t>
-                      </w:r>
-                      <w:r>
-                        <w:rPr>
-                          <w:sz w:val="4"/>
-                          <w:szCs w:val="4"/>
-                        </w:rPr>
-                        <w:t>:</w:t>
-                      </w:r>
-                      <w:r>
-                        <w:rPr>
-                          <w:sz w:val="16"/>
-                          <w:szCs w:val="16"/>
-                        </w:rPr>
-                        <w:t>___________________________________________________________________________________</w:t>
-                      </w:r>
-                      <w:r>
-                        <w:rPr>
-                          <w:sz w:val="16"/>
-                          <w:szCs w:val="16"/>
-                        </w:rPr>
-                        <w:t>___________________________</w:t>
-                      </w:r>
-                      <w:r>
-                        <w:rPr>
-                          <w:sz w:val="16"/>
-                          <w:szCs w:val="16"/>
-                        </w:rPr>
-                        <w:t>_____</w:t>
+                          <w:color w:val="000000"/>
+                          <w:sz w:val="24"/>
+                          <w:szCs w:val="24"/>
+                        </w:rPr>
+                        <w:t xml:space="preserve">ÔNIBUS: </w:t>
                       </w:r>
                     </w:p>
                     <w:p>
                       <w:pPr>
-                        <w:pStyle w:val="Contedodoquadro"/>
-                        <w:overflowPunct w:val="true"/>
+                        <w:pStyle w:val="Contedodoquadrouser"/>
+                        <w:overflowPunct w:val="false"/>
                         <w:bidi w:val="0"/>
-                        <w:spacing w:before="238" w:after="198"/>
+                        <w:spacing w:lineRule="auto" w:line="240" w:before="238" w:after="198"/>
                         <w:jc w:val="left"/>
                         <w:rPr>
-                          <w:sz w:val="4"/>
-                          <w:szCs w:val="4"/>
+                          <w:sz w:val="24"/>
+                          <w:szCs w:val="24"/>
                         </w:rPr>
                       </w:pPr>
                       <w:r>
                         <w:rPr>
-                          <w:sz w:val="16"/>
-                          <w:szCs w:val="16"/>
-                        </w:rPr>
-                        <w:t>SALTAR</w:t>
-                      </w:r>
-                      <w:r>
-                        <w:rPr>
-                          <w:sz w:val="4"/>
-                          <w:szCs w:val="4"/>
-                        </w:rPr>
-                        <w:t>:________________________________________________________________________________________</w:t>
-                      </w:r>
-                      <w:r>
-                        <w:rPr>
-                          <w:sz w:val="4"/>
-                          <w:szCs w:val="4"/>
-                        </w:rPr>
-                        <w:softHyphen/>
-                        <w:t>___________________________________________________________________________________________________________________________________________________________________________________________________________________________________________________________________________________________________________________________________________________________________________________</w:t>
+                          <w:color w:val="000000"/>
+                          <w:sz w:val="24"/>
+                          <w:szCs w:val="24"/>
+                        </w:rPr>
+                        <w:t>SALTAR:</w:t>
                       </w:r>
                     </w:p>
                     <w:p>
                       <w:pPr>
-                        <w:pStyle w:val="Contedodoquadro"/>
-                        <w:overflowPunct w:val="true"/>
+                        <w:pStyle w:val="Contedodoquadrouser"/>
+                        <w:overflowPunct w:val="false"/>
                         <w:bidi w:val="0"/>
-                        <w:spacing w:before="238" w:after="198"/>
+                        <w:spacing w:lineRule="auto" w:line="240" w:before="238" w:after="198"/>
                         <w:jc w:val="left"/>
                         <w:rPr>
-                          <w:sz w:val="16"/>
-                          <w:szCs w:val="16"/>
+                          <w:color w:val="000000"/>
+                          <w:sz w:val="24"/>
+                          <w:szCs w:val="24"/>
                         </w:rPr>
                       </w:pPr>
+                      <w:hyperlink r:id="rId4">
+                        <w:r>
+                          <w:rPr>
+                            <w:rStyle w:val="Hyperlink"/>
+                            <w:color w:val="000000"/>
+                            <w:sz w:val="24"/>
+                            <w:szCs w:val="24"/>
+                            <w:u w:val="none"/>
+                          </w:rPr>
+                          <w:t>DATA:                                   ÀS</w:t>
+                        </w:r>
+                      </w:hyperlink>
                       <w:r>
                         <w:rPr>
-                          <w:sz w:val="16"/>
-                          <w:szCs w:val="16"/>
-                        </w:rPr>
-                        <w:t>DATA:________________________ ÀS__________ HORAS.</w:t>
+                          <w:color w:val="000000"/>
+                          <w:sz w:val="24"/>
+                          <w:szCs w:val="24"/>
+                        </w:rPr>
+                        <w:t xml:space="preserve">                         HORAS.</w:t>
                       </w:r>
                     </w:p>
                     <w:p>
                       <w:pPr>
-                        <w:pStyle w:val="Contedodoquadro"/>
-                        <w:overflowPunct w:val="true"/>
+                        <w:pStyle w:val="Contedodoquadrouser"/>
+                        <w:overflowPunct w:val="false"/>
                         <w:bidi w:val="0"/>
-                        <w:spacing w:before="238" w:after="198"/>
+                        <w:spacing w:lineRule="auto" w:line="240" w:before="238" w:after="198"/>
                         <w:jc w:val="left"/>
                         <w:rPr>
-                          <w:sz w:val="16"/>
-                          <w:szCs w:val="16"/>
+                          <w:color w:val="000000"/>
+                          <w:sz w:val="24"/>
+                          <w:szCs w:val="24"/>
                         </w:rPr>
                       </w:pPr>
                       <w:r>
                         <w:rPr>
-                          <w:sz w:val="16"/>
-                          <w:szCs w:val="16"/>
-                        </w:rPr>
-                        <w:t xml:space="preserve">CONFIRME A PRESENÇA E O Nº DE FAMILIARES A COMPARECER </w:t>
+                          <w:color w:val="000000"/>
+                          <w:sz w:val="24"/>
+                          <w:szCs w:val="24"/>
+                        </w:rPr>
+                        <w:t xml:space="preserve">CONFIRME A PRESENÇA E O Nº DE FAMILIARES A COMPARECER ATRAVÉS DO </w:t>
                       </w:r>
                       <w:r>
                         <w:rPr>
-                          <w:sz w:val="16"/>
-                          <w:szCs w:val="16"/>
-                        </w:rPr>
-                        <w:t xml:space="preserve">ATRAVÉS DO </w:t>
+                          <w:color w:val="000000"/>
+                          <w:sz w:val="24"/>
+                          <w:szCs w:val="24"/>
+                        </w:rPr>
+                        <w:t>WhatsApp</w:t>
                       </w:r>
                     </w:p>
                     <w:p>
                       <w:pPr>
-                        <w:pStyle w:val="Contedodoquadro"/>
-                        <w:overflowPunct w:val="true"/>
+                        <w:pStyle w:val="Contedodoquadrouser"/>
+                        <w:overflowPunct w:val="false"/>
                         <w:bidi w:val="0"/>
-                        <w:spacing w:before="238" w:after="198"/>
+                        <w:spacing w:lineRule="auto" w:line="240" w:before="238" w:after="198"/>
                         <w:jc w:val="left"/>
                         <w:rPr>
-                          <w:sz w:val="16"/>
-                          <w:szCs w:val="16"/>
+                          <w:color w:val="000000"/>
+                          <w:sz w:val="24"/>
+                          <w:szCs w:val="24"/>
                         </w:rPr>
                       </w:pPr>
                       <w:r>
                         <w:rPr>
-                          <w:sz w:val="16"/>
-                          <w:szCs w:val="16"/>
+                          <w:color w:val="000000"/>
+                          <w:sz w:val="24"/>
+                          <w:szCs w:val="24"/>
                         </w:rPr>
                         <w:t>WHATSAPP:______________________________________________________________________</w:t>
                       </w:r>
                     </w:p>
                     <w:p>
                       <w:pPr>
-                        <w:pStyle w:val="Contedodoquadro"/>
-                        <w:overflowPunct w:val="true"/>
+                        <w:pStyle w:val="Contedodoquadrouser"/>
+                        <w:overflowPunct w:val="false"/>
                         <w:bidi w:val="0"/>
                         <w:spacing w:before="238" w:after="198"/>
                         <w:jc w:val="left"/>
                         <w:rPr>
-                          <w:sz w:val="16"/>
-                          <w:szCs w:val="16"/>
+                          <w:color w:val="000000"/>
+                          <w:sz w:val="24"/>
+                          <w:szCs w:val="24"/>
                         </w:rPr>
                       </w:pPr>
                       <w:r>
                         <w:rPr>
-                          <w:sz w:val="16"/>
-                          <w:szCs w:val="16"/>
+                          <w:color w:val="000000"/>
+                          <w:sz w:val="24"/>
+                          <w:szCs w:val="24"/>
                         </w:rPr>
                       </w:r>
                     </w:p>
@@ -801,6 +703,62 @@
                 </v:textbox>
                 <w10:wrap type="none"/>
               </v:rect>
+            </w:pict>
+          </mc:Fallback>
+        </mc:AlternateContent>
+        <mc:AlternateContent>
+          <mc:Choice Requires="wps">
+            <w:drawing>
+              <wp:anchor distT="0" distB="0" distL="0" distR="0" simplePos="0" relativeHeight="7" behindDoc="0" locked="0" layoutInCell="1" allowOverlap="1">
+                <wp:simplePos x="0" y="0"/>
+                <wp:positionH relativeFrom="column">
+                  <wp:posOffset>744220</wp:posOffset>
+                </wp:positionH>
+                <wp:positionV relativeFrom="paragraph">
+                  <wp:posOffset>1410335</wp:posOffset>
+                </wp:positionV>
+                <wp:extent cx="5578475" cy="23495"/>
+                <wp:effectExtent l="635" t="635" r="635" b="635"/>
+                <wp:wrapNone/>
+                <wp:docPr id="4" name="Linha 3"/>
+                <a:graphic xmlns:a="http://schemas.openxmlformats.org/drawingml/2006/main">
+                  <a:graphicData uri="http://schemas.microsoft.com/office/word/2010/wordprocessingShape">
+                    <wps:wsp>
+                      <wps:cNvSpPr/>
+                      <wps:spPr>
+                        <a:xfrm flipV="1">
+                          <a:off x="0" y="0"/>
+                          <a:ext cx="5578560" cy="23400"/>
+                        </a:xfrm>
+                        <a:prstGeom prst="line">
+                          <a:avLst/>
+                        </a:prstGeom>
+                        <a:ln w="0">
+                          <a:solidFill>
+                            <a:srgbClr val="000000"/>
+                          </a:solidFill>
+                        </a:ln>
+                      </wps:spPr>
+                      <wps:style>
+                        <a:lnRef idx="0"/>
+                        <a:fillRef idx="0"/>
+                        <a:effectRef idx="0"/>
+                        <a:fontRef idx="minor"/>
+                      </wps:style>
+                      <wps:bodyPr/>
+                    </wps:wsp>
+                  </a:graphicData>
+                </a:graphic>
+              </wp:anchor>
+            </w:drawing>
+          </mc:Choice>
+          <mc:Fallback>
+            <w:pict>
+              <v:line id="shape_0" from="58.6pt,111.05pt" to="497.8pt,112.85pt" stroked="t" o:allowincell="f" style="position:absolute;flip:y">
+                <v:stroke color="black" joinstyle="round" endcap="flat"/>
+                <v:fill o:detectmouseclick="t" on="false"/>
+                <w10:wrap type="none"/>
+              </v:line>
             </w:pict>
           </mc:Fallback>
         </mc:AlternateContent>
@@ -854,12 +812,404 @@
       </w:pPr>
       <w:r>
         <w:rPr/>
+        <mc:AlternateContent>
+          <mc:Choice Requires="wps">
+            <w:drawing>
+              <wp:anchor distT="0" distB="0" distL="0" distR="0" simplePos="0" relativeHeight="6" behindDoc="0" locked="0" layoutInCell="1" allowOverlap="1">
+                <wp:simplePos x="0" y="0"/>
+                <wp:positionH relativeFrom="column">
+                  <wp:posOffset>422910</wp:posOffset>
+                </wp:positionH>
+                <wp:positionV relativeFrom="paragraph">
+                  <wp:posOffset>3429000</wp:posOffset>
+                </wp:positionV>
+                <wp:extent cx="5702935" cy="17780"/>
+                <wp:effectExtent l="635" t="635" r="635" b="635"/>
+                <wp:wrapNone/>
+                <wp:docPr id="5" name="Linha 2"/>
+                <a:graphic xmlns:a="http://schemas.openxmlformats.org/drawingml/2006/main">
+                  <a:graphicData uri="http://schemas.microsoft.com/office/word/2010/wordprocessingShape">
+                    <wps:wsp>
+                      <wps:cNvSpPr/>
+                      <wps:spPr>
+                        <a:xfrm>
+                          <a:off x="0" y="0"/>
+                          <a:ext cx="5702760" cy="17640"/>
+                        </a:xfrm>
+                        <a:prstGeom prst="line">
+                          <a:avLst/>
+                        </a:prstGeom>
+                        <a:ln w="0">
+                          <a:solidFill>
+                            <a:srgbClr val="000000"/>
+                          </a:solidFill>
+                        </a:ln>
+                      </wps:spPr>
+                      <wps:style>
+                        <a:lnRef idx="0"/>
+                        <a:fillRef idx="0"/>
+                        <a:effectRef idx="0"/>
+                        <a:fontRef idx="minor"/>
+                      </wps:style>
+                      <wps:bodyPr/>
+                    </wps:wsp>
+                  </a:graphicData>
+                </a:graphic>
+              </wp:anchor>
+            </w:drawing>
+          </mc:Choice>
+          <mc:Fallback>
+            <w:pict>
+              <v:line id="shape_0" from="33.3pt,270pt" to="482.3pt,271.35pt" stroked="t" o:allowincell="f" style="position:absolute">
+                <v:stroke color="black" joinstyle="round" endcap="flat"/>
+                <v:fill o:detectmouseclick="t" on="false"/>
+                <w10:wrap type="none"/>
+              </v:line>
+            </w:pict>
+          </mc:Fallback>
+        </mc:AlternateContent>
+        <mc:AlternateContent>
+          <mc:Choice Requires="wps">
+            <w:drawing>
+              <wp:anchor distT="0" distB="0" distL="0" distR="0" simplePos="0" relativeHeight="8" behindDoc="0" locked="0" layoutInCell="1" allowOverlap="1">
+                <wp:simplePos x="0" y="0"/>
+                <wp:positionH relativeFrom="column">
+                  <wp:posOffset>1696720</wp:posOffset>
+                </wp:positionH>
+                <wp:positionV relativeFrom="paragraph">
+                  <wp:posOffset>1431925</wp:posOffset>
+                </wp:positionV>
+                <wp:extent cx="4619625" cy="0"/>
+                <wp:effectExtent l="635" t="635" r="635" b="635"/>
+                <wp:wrapNone/>
+                <wp:docPr id="6" name="Linha 4"/>
+                <a:graphic xmlns:a="http://schemas.openxmlformats.org/drawingml/2006/main">
+                  <a:graphicData uri="http://schemas.microsoft.com/office/word/2010/wordprocessingShape">
+                    <wps:wsp>
+                      <wps:cNvSpPr/>
+                      <wps:spPr>
+                        <a:xfrm>
+                          <a:off x="0" y="0"/>
+                          <a:ext cx="4619520" cy="0"/>
+                        </a:xfrm>
+                        <a:prstGeom prst="line">
+                          <a:avLst/>
+                        </a:prstGeom>
+                        <a:ln w="0">
+                          <a:solidFill>
+                            <a:srgbClr val="000000"/>
+                          </a:solidFill>
+                        </a:ln>
+                      </wps:spPr>
+                      <wps:style>
+                        <a:lnRef idx="0"/>
+                        <a:fillRef idx="0"/>
+                        <a:effectRef idx="0"/>
+                        <a:fontRef idx="minor"/>
+                      </wps:style>
+                      <wps:bodyPr/>
+                    </wps:wsp>
+                  </a:graphicData>
+                </a:graphic>
+              </wp:anchor>
+            </w:drawing>
+          </mc:Choice>
+          <mc:Fallback>
+            <w:pict>
+              <v:line id="shape_0" from="133.6pt,112.75pt" to="497.3pt,112.75pt" stroked="t" o:allowincell="f" style="position:absolute">
+                <v:stroke color="black" joinstyle="round" endcap="flat"/>
+                <v:fill o:detectmouseclick="t" on="false"/>
+                <w10:wrap type="none"/>
+              </v:line>
+            </w:pict>
+          </mc:Fallback>
+        </mc:AlternateContent>
+        <mc:AlternateContent>
+          <mc:Choice Requires="wps">
+            <w:drawing>
+              <wp:anchor distT="0" distB="0" distL="0" distR="0" simplePos="0" relativeHeight="9" behindDoc="0" locked="0" layoutInCell="1" allowOverlap="1">
+                <wp:simplePos x="0" y="0"/>
+                <wp:positionH relativeFrom="column">
+                  <wp:posOffset>762000</wp:posOffset>
+                </wp:positionH>
+                <wp:positionV relativeFrom="paragraph">
+                  <wp:posOffset>1027430</wp:posOffset>
+                </wp:positionV>
+                <wp:extent cx="5596255" cy="31750"/>
+                <wp:effectExtent l="635" t="635" r="635" b="635"/>
+                <wp:wrapNone/>
+                <wp:docPr id="7" name="Linha horizontal 1"/>
+                <a:graphic xmlns:a="http://schemas.openxmlformats.org/drawingml/2006/main">
+                  <a:graphicData uri="http://schemas.microsoft.com/office/word/2010/wordprocessingShape">
+                    <wps:wsp>
+                      <wps:cNvSpPr/>
+                      <wps:spPr>
+                        <a:xfrm>
+                          <a:off x="0" y="0"/>
+                          <a:ext cx="5596200" cy="31680"/>
+                        </a:xfrm>
+                        <a:prstGeom prst="line">
+                          <a:avLst/>
+                        </a:prstGeom>
+                        <a:ln w="0">
+                          <a:solidFill>
+                            <a:srgbClr val="000000"/>
+                          </a:solidFill>
+                        </a:ln>
+                      </wps:spPr>
+                      <wps:style>
+                        <a:lnRef idx="0"/>
+                        <a:fillRef idx="0"/>
+                        <a:effectRef idx="0"/>
+                        <a:fontRef idx="minor"/>
+                      </wps:style>
+                      <wps:bodyPr/>
+                    </wps:wsp>
+                  </a:graphicData>
+                </a:graphic>
+              </wp:anchor>
+            </w:drawing>
+          </mc:Choice>
+          <mc:Fallback>
+            <w:pict>
+              <v:line id="shape_0" from="60pt,80.9pt" to="500.6pt,83.35pt" stroked="t" o:allowincell="f" style="position:absolute">
+                <v:stroke color="black" joinstyle="round" endcap="flat"/>
+                <v:fill o:detectmouseclick="t" on="false"/>
+                <w10:wrap type="none"/>
+              </v:line>
+            </w:pict>
+          </mc:Fallback>
+        </mc:AlternateContent>
+        <mc:AlternateContent>
+          <mc:Choice Requires="wps">
+            <w:drawing>
+              <wp:anchor distT="0" distB="0" distL="0" distR="0" simplePos="0" relativeHeight="10" behindDoc="0" locked="0" layoutInCell="1" allowOverlap="1">
+                <wp:simplePos x="0" y="0"/>
+                <wp:positionH relativeFrom="column">
+                  <wp:posOffset>506730</wp:posOffset>
+                </wp:positionH>
+                <wp:positionV relativeFrom="paragraph">
+                  <wp:posOffset>1918970</wp:posOffset>
+                </wp:positionV>
+                <wp:extent cx="5798185" cy="0"/>
+                <wp:effectExtent l="635" t="635" r="635" b="635"/>
+                <wp:wrapNone/>
+                <wp:docPr id="8" name="Linha horizontal 2"/>
+                <a:graphic xmlns:a="http://schemas.openxmlformats.org/drawingml/2006/main">
+                  <a:graphicData uri="http://schemas.microsoft.com/office/word/2010/wordprocessingShape">
+                    <wps:wsp>
+                      <wps:cNvSpPr/>
+                      <wps:spPr>
+                        <a:xfrm>
+                          <a:off x="0" y="0"/>
+                          <a:ext cx="5798160" cy="0"/>
+                        </a:xfrm>
+                        <a:prstGeom prst="line">
+                          <a:avLst/>
+                        </a:prstGeom>
+                        <a:ln w="0">
+                          <a:solidFill>
+                            <a:srgbClr val="000000"/>
+                          </a:solidFill>
+                        </a:ln>
+                      </wps:spPr>
+                      <wps:style>
+                        <a:lnRef idx="0"/>
+                        <a:fillRef idx="0"/>
+                        <a:effectRef idx="0"/>
+                        <a:fontRef idx="minor"/>
+                      </wps:style>
+                      <wps:bodyPr/>
+                    </wps:wsp>
+                  </a:graphicData>
+                </a:graphic>
+              </wp:anchor>
+            </w:drawing>
+          </mc:Choice>
+          <mc:Fallback>
+            <w:pict>
+              <v:line id="shape_0" from="39.9pt,151.1pt" to="496.4pt,151.1pt" stroked="t" o:allowincell="f" style="position:absolute">
+                <v:stroke color="black" joinstyle="round" endcap="flat"/>
+                <v:fill o:detectmouseclick="t" on="false"/>
+                <w10:wrap type="none"/>
+              </v:line>
+            </w:pict>
+          </mc:Fallback>
+        </mc:AlternateContent>
+        <mc:AlternateContent>
+          <mc:Choice Requires="wps">
+            <w:drawing>
+              <wp:anchor distT="0" distB="0" distL="0" distR="0" simplePos="0" relativeHeight="11" behindDoc="0" locked="0" layoutInCell="1" allowOverlap="1">
+                <wp:simplePos x="0" y="0"/>
+                <wp:positionH relativeFrom="column">
+                  <wp:posOffset>327660</wp:posOffset>
+                </wp:positionH>
+                <wp:positionV relativeFrom="paragraph">
+                  <wp:posOffset>2858135</wp:posOffset>
+                </wp:positionV>
+                <wp:extent cx="1333500" cy="0"/>
+                <wp:effectExtent l="635" t="635" r="635" b="635"/>
+                <wp:wrapNone/>
+                <wp:docPr id="9" name="Linha 1"/>
+                <a:graphic xmlns:a="http://schemas.openxmlformats.org/drawingml/2006/main">
+                  <a:graphicData uri="http://schemas.microsoft.com/office/word/2010/wordprocessingShape">
+                    <wps:wsp>
+                      <wps:cNvSpPr/>
+                      <wps:spPr>
+                        <a:xfrm>
+                          <a:off x="0" y="0"/>
+                          <a:ext cx="1333440" cy="0"/>
+                        </a:xfrm>
+                        <a:prstGeom prst="line">
+                          <a:avLst/>
+                        </a:prstGeom>
+                        <a:ln w="0">
+                          <a:solidFill>
+                            <a:srgbClr val="000000"/>
+                          </a:solidFill>
+                        </a:ln>
+                      </wps:spPr>
+                      <wps:style>
+                        <a:lnRef idx="0"/>
+                        <a:fillRef idx="0"/>
+                        <a:effectRef idx="0"/>
+                        <a:fontRef idx="minor"/>
+                      </wps:style>
+                      <wps:bodyPr/>
+                    </wps:wsp>
+                  </a:graphicData>
+                </a:graphic>
+              </wp:anchor>
+            </w:drawing>
+          </mc:Choice>
+          <mc:Fallback>
+            <w:pict>
+              <v:line id="shape_0" from="25.8pt,225.05pt" to="130.75pt,225.05pt" stroked="t" o:allowincell="f" style="position:absolute">
+                <v:stroke color="black" joinstyle="round" endcap="flat"/>
+                <v:fill o:detectmouseclick="t" on="false"/>
+                <w10:wrap type="none"/>
+              </v:line>
+            </w:pict>
+          </mc:Fallback>
+        </mc:AlternateContent>
+        <mc:AlternateContent>
+          <mc:Choice Requires="wps">
+            <w:drawing>
+              <wp:anchor distT="0" distB="0" distL="0" distR="0" simplePos="0" relativeHeight="12" behindDoc="0" locked="0" layoutInCell="1" allowOverlap="1">
+                <wp:simplePos x="0" y="0"/>
+                <wp:positionH relativeFrom="column">
+                  <wp:posOffset>1905635</wp:posOffset>
+                </wp:positionH>
+                <wp:positionV relativeFrom="paragraph">
+                  <wp:posOffset>2828290</wp:posOffset>
+                </wp:positionV>
+                <wp:extent cx="975995" cy="0"/>
+                <wp:effectExtent l="635" t="635" r="635" b="635"/>
+                <wp:wrapNone/>
+                <wp:docPr id="10" name="Linha horizontal 3"/>
+                <a:graphic xmlns:a="http://schemas.openxmlformats.org/drawingml/2006/main">
+                  <a:graphicData uri="http://schemas.microsoft.com/office/word/2010/wordprocessingShape">
+                    <wps:wsp>
+                      <wps:cNvSpPr/>
+                      <wps:spPr>
+                        <a:xfrm>
+                          <a:off x="0" y="0"/>
+                          <a:ext cx="975960" cy="0"/>
+                        </a:xfrm>
+                        <a:prstGeom prst="line">
+                          <a:avLst/>
+                        </a:prstGeom>
+                        <a:ln w="0">
+                          <a:solidFill>
+                            <a:srgbClr val="000000"/>
+                          </a:solidFill>
+                        </a:ln>
+                      </wps:spPr>
+                      <wps:style>
+                        <a:lnRef idx="0"/>
+                        <a:fillRef idx="0"/>
+                        <a:effectRef idx="0"/>
+                        <a:fontRef idx="minor"/>
+                      </wps:style>
+                      <wps:bodyPr/>
+                    </wps:wsp>
+                  </a:graphicData>
+                </a:graphic>
+              </wp:anchor>
+            </w:drawing>
+          </mc:Choice>
+          <mc:Fallback>
+            <w:pict>
+              <v:line id="shape_0" from="150.05pt,222.7pt" to="226.85pt,222.7pt" stroked="t" o:allowincell="f" style="position:absolute">
+                <v:stroke color="black" joinstyle="round" endcap="flat"/>
+                <v:fill o:detectmouseclick="t" on="false"/>
+                <w10:wrap type="none"/>
+              </v:line>
+            </w:pict>
+          </mc:Fallback>
+        </mc:AlternateContent>
+        <mc:AlternateContent>
+          <mc:Choice Requires="wps">
+            <w:drawing>
+              <wp:anchor distT="0" distB="0" distL="0" distR="0" simplePos="0" relativeHeight="13" behindDoc="0" locked="0" layoutInCell="1" allowOverlap="1">
+                <wp:simplePos x="0" y="0"/>
+                <wp:positionH relativeFrom="column">
+                  <wp:posOffset>554355</wp:posOffset>
+                </wp:positionH>
+                <wp:positionV relativeFrom="paragraph">
+                  <wp:posOffset>2352040</wp:posOffset>
+                </wp:positionV>
+                <wp:extent cx="5715000" cy="0"/>
+                <wp:effectExtent l="635" t="635" r="635" b="635"/>
+                <wp:wrapNone/>
+                <wp:docPr id="11" name="Linha 6"/>
+                <a:graphic xmlns:a="http://schemas.openxmlformats.org/drawingml/2006/main">
+                  <a:graphicData uri="http://schemas.microsoft.com/office/word/2010/wordprocessingShape">
+                    <wps:wsp>
+                      <wps:cNvSpPr/>
+                      <wps:spPr>
+                        <a:xfrm>
+                          <a:off x="0" y="0"/>
+                          <a:ext cx="5715000" cy="0"/>
+                        </a:xfrm>
+                        <a:prstGeom prst="line">
+                          <a:avLst/>
+                        </a:prstGeom>
+                        <a:ln w="0">
+                          <a:solidFill>
+                            <a:srgbClr val="000000"/>
+                          </a:solidFill>
+                        </a:ln>
+                      </wps:spPr>
+                      <wps:style>
+                        <a:lnRef idx="0"/>
+                        <a:fillRef idx="0"/>
+                        <a:effectRef idx="0"/>
+                        <a:fontRef idx="minor"/>
+                      </wps:style>
+                      <wps:bodyPr/>
+                    </wps:wsp>
+                  </a:graphicData>
+                </a:graphic>
+              </wp:anchor>
+            </w:drawing>
+          </mc:Choice>
+          <mc:Fallback>
+            <w:pict>
+              <v:line id="shape_0" from="43.65pt,185.2pt" to="493.6pt,185.2pt" stroked="t" o:allowincell="f" style="position:absolute">
+                <v:stroke color="black" joinstyle="round" endcap="flat"/>
+                <v:fill o:detectmouseclick="t" on="false"/>
+                <w10:wrap type="none"/>
+              </v:line>
+            </w:pict>
+          </mc:Fallback>
+        </mc:AlternateContent>
       </w:r>
     </w:p>
     <w:sectPr>
-      <w:headerReference w:type="even" r:id="rId3"/>
-      <w:headerReference w:type="default" r:id="rId4"/>
-      <w:headerReference w:type="first" r:id="rId5"/>
+      <w:headerReference w:type="even" r:id="rId5"/>
+      <w:headerReference w:type="default" r:id="rId6"/>
+      <w:headerReference w:type="first" r:id="rId7"/>
       <w:type w:val="nextPage"/>
       <w:pgSz w:w="11906" w:h="16838"/>
       <w:pgMar w:left="1134" w:right="1134" w:gutter="0" w:header="1134" w:top="1693" w:footer="0" w:bottom="1134"/>
@@ -955,10 +1305,18 @@
       <w:lang w:val="pt-BR" w:eastAsia="zh-CN" w:bidi="hi-IN"/>
     </w:rPr>
   </w:style>
+  <w:style w:type="character" w:styleId="Hyperlink">
+    <w:name w:val="Hyperlink"/>
+    <w:rPr>
+      <w:color w:val="000080"/>
+      <w:u w:val="single"/>
+    </w:rPr>
+  </w:style>
   <w:style w:type="paragraph" w:styleId="Ttulo">
     <w:name w:val="Título"/>
     <w:basedOn w:val="Normal"/>
     <w:next w:val="BodyText"/>
+    <w:qFormat/>
     <w:pPr>
       <w:keepNext w:val="true"/>
       <w:spacing w:before="240" w:after="120"/>
@@ -1004,6 +1362,7 @@
   <w:style w:type="paragraph" w:styleId="ndice">
     <w:name w:val="Índice"/>
     <w:basedOn w:val="Normal"/>
+    <w:qFormat/>
     <w:pPr>
       <w:suppressLineNumbers/>
     </w:pPr>
@@ -1015,7 +1374,6 @@
     <w:name w:val="Título (user)"/>
     <w:basedOn w:val="Normal"/>
     <w:next w:val="BodyText"/>
-    <w:qFormat/>
     <w:pPr>
       <w:keepNext w:val="true"/>
       <w:spacing w:before="240" w:after="120"/>
@@ -1029,7 +1387,6 @@
   <w:style w:type="paragraph" w:styleId="ndiceuser">
     <w:name w:val="Índice (user)"/>
     <w:basedOn w:val="Normal"/>
-    <w:qFormat/>
     <w:pPr>
       <w:suppressLineNumbers/>
     </w:pPr>
@@ -1037,8 +1394,8 @@
       <w:rFonts w:cs="Arial"/>
     </w:rPr>
   </w:style>
-  <w:style w:type="paragraph" w:styleId="Cabealhoerodapuser">
-    <w:name w:val="Cabeçalho e rodapé (user)"/>
+  <w:style w:type="paragraph" w:styleId="Cabealhoerodap">
+    <w:name w:val="Cabeçalho e rodapé"/>
     <w:basedOn w:val="Normal"/>
     <w:qFormat/>
     <w:pPr>
@@ -1051,18 +1408,24 @@
     </w:pPr>
     <w:rPr/>
   </w:style>
-  <w:style w:type="paragraph" w:styleId="Cabealhoerodap">
-    <w:name w:val="Cabeçalho e rodapé"/>
+  <w:style w:type="paragraph" w:styleId="Cabealhoerodapuser">
+    <w:name w:val="Cabeçalho e rodapé (user)"/>
     <w:basedOn w:val="Normal"/>
     <w:pPr/>
     <w:rPr/>
   </w:style>
   <w:style w:type="paragraph" w:styleId="Header">
     <w:name w:val="header"/>
-    <w:basedOn w:val="Cabealhoerodapuser"/>
+    <w:basedOn w:val="Cabealhoerodap"/>
     <w:pPr>
       <w:suppressLineNumbers/>
     </w:pPr>
+    <w:rPr/>
+  </w:style>
+  <w:style w:type="paragraph" w:styleId="Contedodoquadrouser">
+    <w:name w:val="Conteúdo do quadro (user)"/>
+    <w:basedOn w:val="Normal"/>
+    <w:pPr/>
     <w:rPr/>
   </w:style>
   <w:style w:type="paragraph" w:styleId="Contedodoquadro">

</xml_diff>